<commit_message>
Resume: apply review edits, add Sales Club, fix typos
Co-Authored-By: Claude Opus 5.5 <noreply@anthropic.com>
Claude-Session: https://claude.ai/code/session_0172tuBJwasMeAmUQNPV2Q7h
</commit_message>
<xml_diff>
--- a/Carlos_Molero_Resume.docx
+++ b/Carlos_Molero_Resume.docx
@@ -128,7 +128,7 @@
           <w:color w:val="000000"/>
           <w:sz w:val="19"/>
         </w:rPr>
-        <w:t xml:space="preserve">Relevant Coursework: </w:t>
+        <w:t xml:space="preserve">MBA Coursework: </w:t>
       </w:r>
       <w:r>
         <w:rPr>
@@ -137,7 +137,33 @@
           <w:color w:val="000000"/>
           <w:sz w:val="19"/>
         </w:rPr>
-        <w:t>Global Financial System, Global Dimensions in Business, Operations Management, Management and Leading in Business</w:t>
+        <w:t>Business Negotiations, Leading People and Organizations</w:t>
+      </w:r>
+    </w:p>
+    <w:p>
+      <w:pPr>
+        <w:tabs>
+          <w:tab w:pos="9360" w:val="right"/>
+        </w:tabs>
+        <w:spacing w:before="0" w:after="0"/>
+      </w:pPr>
+      <w:r>
+        <w:rPr>
+          <w:b/>
+          <w:i w:val="0"/>
+          <w:color w:val="000000"/>
+          <w:sz w:val="19"/>
+        </w:rPr>
+        <w:t xml:space="preserve">BBA Coursework: </w:t>
+      </w:r>
+      <w:r>
+        <w:rPr>
+          <w:b w:val="0"/>
+          <w:i w:val="0"/>
+          <w:color w:val="000000"/>
+          <w:sz w:val="19"/>
+        </w:rPr>
+        <w:t>Public Speaking, Operations Management, Management &amp; Leading in Business</w:t>
       </w:r>
     </w:p>
     <w:p>
@@ -154,7 +180,7 @@
           <w:color w:val="000000"/>
           <w:sz w:val="20"/>
         </w:rPr>
-        <w:t>University of the Ozarks — Completed Coursework</w:t>
+        <w:t>University of the Ozarks</w:t>
       </w:r>
       <w:r>
         <w:rPr>
@@ -202,6 +228,99 @@
           <w:sz w:val="20"/>
           <w:spacing w:val="30"/>
         </w:rPr>
+        <w:t>PROJECTS &amp; INVOLVEMENT</w:t>
+      </w:r>
+    </w:p>
+    <w:p>
+      <w:pPr>
+        <w:tabs>
+          <w:tab w:pos="9360" w:val="right"/>
+        </w:tabs>
+        <w:spacing w:before="0" w:after="0"/>
+      </w:pPr>
+      <w:r>
+        <w:rPr>
+          <w:b/>
+          <w:i w:val="0"/>
+          <w:color w:val="000000"/>
+          <w:sz w:val="20"/>
+        </w:rPr>
+        <w:t>Sales Club Member</w:t>
+      </w:r>
+      <w:r>
+        <w:rPr>
+          <w:b w:val="0"/>
+          <w:i w:val="0"/>
+          <w:color w:val="595959"/>
+          <w:sz w:val="18"/>
+        </w:rPr>
+        <w:tab/>
+      </w:r>
+    </w:p>
+    <w:p>
+      <w:pPr>
+        <w:tabs>
+          <w:tab w:pos="9360" w:val="right"/>
+        </w:tabs>
+        <w:spacing w:before="0" w:after="0"/>
+      </w:pPr>
+      <w:r>
+        <w:rPr>
+          <w:b w:val="0"/>
+          <w:i/>
+          <w:color w:val="595959"/>
+          <w:sz w:val="19"/>
+        </w:rPr>
+        <w:t>Southern New Hampshire University — Manchester, NH</w:t>
+      </w:r>
+    </w:p>
+    <w:p>
+      <w:pPr>
+        <w:tabs>
+          <w:tab w:pos="259" w:val="left"/>
+          <w:tab w:pos="9360" w:val="right"/>
+        </w:tabs>
+        <w:spacing w:before="0" w:after="0"/>
+        <w:ind w:left="259" w:hanging="173"/>
+      </w:pPr>
+      <w:r>
+        <w:rPr>
+          <w:b w:val="0"/>
+          <w:i w:val="0"/>
+          <w:color w:val="000000"/>
+          <w:sz w:val="19"/>
+        </w:rPr>
+        <w:t>•</w:t>
+        <w:tab/>
+      </w:r>
+      <w:r>
+        <w:rPr>
+          <w:b w:val="0"/>
+          <w:i w:val="0"/>
+          <w:color w:val="000000"/>
+          <w:sz w:val="19"/>
+        </w:rPr>
+        <w:t>Compete in sales competitions and attend club meetings to build prospecting and pitching skills.</w:t>
+      </w:r>
+    </w:p>
+    <w:p>
+      <w:pPr>
+        <w:tabs>
+          <w:tab w:pos="9360" w:val="right"/>
+        </w:tabs>
+        <w:spacing w:before="160" w:after="80"/>
+        <w:pBdr>
+          <w:bottom w:val="single" w:sz="6" w:space="1" w:color="1F3864"/>
+        </w:pBdr>
+      </w:pPr>
+      <w:r>
+        <w:rPr>
+          <w:b/>
+          <w:i w:val="0"/>
+          <w:color w:val="1F3864"/>
+          <w:sz w:val="20"/>
+          <w:spacing w:val="30"/>
+        </w:rPr>
         <w:t>EXPERIENCE</w:t>
       </w:r>
     </w:p>
@@ -219,7 +338,7 @@
           <w:color w:val="000000"/>
           <w:sz w:val="20"/>
         </w:rPr>
-        <w:t>Financial &amp; Operations Intern to the General Manager</w:t>
+        <w:t>Financial &amp; Operations Intern</w:t>
       </w:r>
       <w:r>
         <w:rPr>
@@ -333,7 +452,7 @@
           <w:color w:val="000000"/>
           <w:sz w:val="19"/>
         </w:rPr>
-        <w:t>Supported club programs and events while maintaining strong member and client relationships.</w:t>
+        <w:t>Supported club programs and events and helped launch a new client development initiative.</w:t>
       </w:r>
     </w:p>
     <w:p>
@@ -508,7 +627,7 @@
           <w:color w:val="000000"/>
           <w:sz w:val="19"/>
         </w:rPr>
-        <w:t>Evaluated players’ strengths and weaknesses to build individualized training plans for athletic and personal growth.</w:t>
+        <w:t>Evaluated players’ strengths and weaknesses to build individualized training plans.</w:t>
       </w:r>
     </w:p>
     <w:p>
@@ -683,7 +802,7 @@
           <w:color w:val="000000"/>
           <w:sz w:val="19"/>
         </w:rPr>
-        <w:t>Promoted the university’s mission and programs to prospective students and families, building lasting connections.</w:t>
+        <w:t>Promoted the university’s mission and programs to prospective students and families.</w:t>
       </w:r>
     </w:p>
     <w:p>
@@ -762,7 +881,7 @@
           <w:color w:val="000000"/>
           <w:sz w:val="19"/>
         </w:rPr>
-        <w:t>Team Captain</w:t>
+        <w:t>Team Captain &amp; Player</w:t>
       </w:r>
       <w:r>
         <w:rPr>
@@ -799,7 +918,7 @@
           <w:color w:val="000000"/>
           <w:sz w:val="19"/>
         </w:rPr>
-        <w:t>Lead and motivate teammates through training and competition; NE-10 First Team Singles and 24 ELITE Trophy (best academic record among NE-10 Conference Playoff players), 2025–26.</w:t>
+        <w:t>Lead and motivate teammates; 2025–26 NE-10 First Team Singles; 24 ELITE Trophy (top playoff GPA).</w:t>
       </w:r>
     </w:p>
     <w:p>
@@ -951,6 +1070,32 @@
           <w:color w:val="000000"/>
           <w:sz w:val="19"/>
         </w:rPr>
+        <w:t xml:space="preserve">Sales: </w:t>
+      </w:r>
+      <w:r>
+        <w:rPr>
+          <w:b w:val="0"/>
+          <w:i w:val="0"/>
+          <w:color w:val="000000"/>
+          <w:sz w:val="19"/>
+        </w:rPr>
+        <w:t>Lead generation, relationship building, CRM</w:t>
+      </w:r>
+    </w:p>
+    <w:p>
+      <w:pPr>
+        <w:tabs>
+          <w:tab w:pos="9360" w:val="right"/>
+        </w:tabs>
+        <w:spacing w:before="0" w:after="0"/>
+      </w:pPr>
+      <w:r>
+        <w:rPr>
+          <w:b/>
+          <w:i w:val="0"/>
+          <w:color w:val="000000"/>
+          <w:sz w:val="19"/>
+        </w:rPr>
         <w:t xml:space="preserve">Business: </w:t>
       </w:r>
       <w:r>
@@ -960,7 +1105,7 @@
           <w:color w:val="000000"/>
           <w:sz w:val="19"/>
         </w:rPr>
-        <w:t>Client relationship management, accounts receivable, payroll administration, POS systems, budgeting, revenue tracking</w:t>
+        <w:t>Accounts receivable, payroll administration, POS systems, budgeting, revenue tracking</w:t>
       </w:r>
     </w:p>
     <w:p>

</xml_diff>